<commit_message>
Update narration scripts to match latest features
</commit_message>
<xml_diff>
--- a/PPT配套解说词.docx
+++ b/PPT配套解说词.docx
@@ -3,1291 +3,510 @@
 <w:document xmlns:wpc="http://schemas.microsoft.com/office/word/2010/wordprocessingCanvas" xmlns:mo="http://schemas.microsoft.com/office/mac/office/2008/main" xmlns:mc="http://schemas.openxmlformats.org/markup-compatibility/2006" xmlns:mv="urn:schemas-microsoft-com:mac:vml" xmlns:o="urn:schemas-microsoft-com:office:office" xmlns:r="http://schemas.openxmlformats.org/officeDocument/2006/relationships" xmlns:m="http://schemas.openxmlformats.org/officeDocument/2006/math" xmlns:v="urn:schemas-microsoft-com:vml" xmlns:wp14="http://schemas.microsoft.com/office/word/2010/wordprocessingDrawing" xmlns:wp="http://schemas.openxmlformats.org/drawingml/2006/wordprocessingDrawing" xmlns:w10="urn:schemas-microsoft-com:office:word" xmlns:w="http://schemas.openxmlformats.org/wordprocessingml/2006/main" xmlns:w14="http://schemas.microsoft.com/office/word/2010/wordml" xmlns:wpg="http://schemas.microsoft.com/office/word/2010/wordprocessingGroup" xmlns:wpi="http://schemas.microsoft.com/office/word/2010/wordprocessingInk" xmlns:wne="http://schemas.microsoft.com/office/word/2006/wordml" xmlns:wps="http://schemas.microsoft.com/office/word/2010/wordprocessingShape" mc:Ignorable="w14 wp14">
   <w:body>
     <w:p>
-      <w:pPr>
-        <w:jc w:val="center"/>
-      </w:pPr>
       <w:r>
         <w:rPr>
-          <w:rFonts w:ascii="黑体" w:hAnsi="黑体" w:eastAsia="黑体"/>
           <w:b/>
-          <w:sz w:val="36"/>
+          <w:sz w:val="32"/>
         </w:rPr>
-        <w:t>《动物习作AI智能助教》演示视频</w:t>
-      </w:r>
-    </w:p>
-    <w:p>
-      <w:pPr>
-        <w:jc w:val="center"/>
-      </w:pPr>
-      <w:r>
-        <w:rPr>
-          <w:rFonts w:ascii="楷体_GB2312" w:hAnsi="楷体_GB2312" w:eastAsia="楷体_GB2312"/>
-          <w:b w:val="0"/>
-          <w:color w:val="666666"/>
-          <w:sz w:val="28"/>
-        </w:rPr>
-        <w:t>逐页解说脚本 · 与PPT严格对应</w:t>
+        <w:t>《动物习作AI智能助教》PPT配套解说词</w:t>
       </w:r>
     </w:p>
     <w:p>
       <w:r>
         <w:rPr>
-          <w:rFonts w:ascii="黑体" w:hAnsi="黑体" w:eastAsia="黑体"/>
-          <w:b/>
-          <w:sz w:val="28"/>
+          <w:b w:val="0"/>
+          <w:sz w:val="24"/>
         </w:rPr>
-        <w:t>总时长控制：8分钟以内</w:t>
       </w:r>
     </w:p>
     <w:p>
       <w:r>
         <w:rPr>
-          <w:rFonts w:ascii="仿宋_GB2312" w:hAnsi="仿宋_GB2312" w:eastAsia="仿宋_GB2312"/>
           <w:b w:val="0"/>
-          <w:sz w:val="28"/>
+          <w:sz w:val="20"/>
         </w:rPr>
-        <w:t>方式：PPT翻页 + 屏幕录屏穿插 + 语音解说</w:t>
+        <w:t>总时长：≤8分钟 | 方式：PPT翻页+录屏穿插+语音解说</w:t>
       </w:r>
     </w:p>
     <w:p>
       <w:r>
         <w:rPr>
-          <w:rFonts w:ascii="仿宋_GB2312" w:hAnsi="仿宋_GB2312" w:eastAsia="仿宋_GB2312"/>
           <w:b w:val="0"/>
-          <w:color w:val="999999"/>
           <w:sz w:val="24"/>
         </w:rPr>
-        <w:t>注：引用学生反馈或AI回复时可标注"此内容由AI生成"</w:t>
-      </w:r>
-    </w:p>
-    <w:p/>
-    <w:p>
-      <w:pPr>
-        <w:spacing w:before="240"/>
-      </w:pPr>
-      <w:r>
-        <w:rPr>
-          <w:rFonts w:ascii="黑体" w:hAnsi="黑体" w:eastAsia="黑体"/>
-          <w:b/>
-          <w:sz w:val="32"/>
-        </w:rPr>
-        <w:t>【第1页 · 封面】</w:t>
       </w:r>
     </w:p>
     <w:p>
       <w:r>
         <w:rPr>
-          <w:rFonts w:ascii="楷体_GB2312" w:hAnsi="楷体_GB2312" w:eastAsia="楷体_GB2312"/>
-          <w:b/>
-          <w:color w:val="CC3333"/>
+          <w:b w:val="0"/>
           <w:sz w:val="24"/>
         </w:rPr>
-        <w:t>⏱ 15秒</w:t>
       </w:r>
     </w:p>
     <w:p>
       <w:r>
         <w:rPr>
-          <w:rFonts w:ascii="楷体_GB2312" w:hAnsi="楷体_GB2312" w:eastAsia="楷体_GB2312"/>
-          <w:b w:val="0"/>
-          <w:color w:val="996600"/>
-          <w:sz w:val="24"/>
+          <w:b/>
+          <w:sz w:val="22"/>
         </w:rPr>
-        <w:t>📺 画面：PPT封面页</w:t>
+        <w:t>── 第1页 封面（15秒） ──</w:t>
       </w:r>
     </w:p>
     <w:p>
       <w:r>
         <w:rPr>
-          <w:rFonts w:ascii="楷体_GB2312" w:hAnsi="楷体_GB2312" w:eastAsia="楷体_GB2312"/>
           <w:b w:val="0"/>
-          <w:color w:val="996600"/>
-          <w:sz w:val="24"/>
+          <w:sz w:val="20"/>
+        </w:rPr>
+        <w:t>画面：PPT封面</w:t>
+      </w:r>
+    </w:p>
+    <w:p>
+      <w:r>
+        <w:rPr>
+          <w:b w:val="0"/>
+          <w:sz w:val="20"/>
         </w:rPr>
         <w:t>字幕：动物习作AI智能助教 | 惠州市富民小学 许志超</w:t>
       </w:r>
     </w:p>
     <w:p>
-      <w:pPr>
-        <w:spacing w:line="480" w:lineRule="exact"/>
-        <w:ind w:firstLine="420"/>
-      </w:pPr>
       <w:r>
         <w:rPr>
-          <w:rFonts w:ascii="仿宋_GB2312" w:hAnsi="仿宋_GB2312" w:eastAsia="仿宋_GB2312"/>
           <w:b w:val="0"/>
-          <w:sz w:val="28"/>
+          <w:sz w:val="20"/>
         </w:rPr>
-        <w:t>大家好，我是惠州市富民小学的语文教师许志超。今天我带来的案例是《动物习作AI智能助教》。</w:t>
-      </w:r>
-    </w:p>
-    <w:p>
-      <w:pPr>
-        <w:spacing w:before="240"/>
-      </w:pPr>
-      <w:r>
-        <w:rPr>
-          <w:rFonts w:ascii="黑体" w:hAnsi="黑体" w:eastAsia="黑体"/>
-          <w:b/>
-          <w:sz w:val="32"/>
-        </w:rPr>
-        <w:t>【第2页 · 案例概述】</w:t>
       </w:r>
     </w:p>
     <w:p>
       <w:r>
         <w:rPr>
-          <w:rFonts w:ascii="楷体_GB2312" w:hAnsi="楷体_GB2312" w:eastAsia="楷体_GB2312"/>
-          <w:b/>
-          <w:color w:val="CC3333"/>
-          <w:sz w:val="24"/>
+          <w:b w:val="0"/>
+          <w:sz w:val="20"/>
         </w:rPr>
-        <w:t>⏱ 1分45秒</w:t>
+        <w:t>解说：大家好，我是惠州市富民小学语文教师许志超。今天我带来的案例是《动物习作AI智能助教》，一款专为小学语文教师设计的AI辅助教学工具。</w:t>
       </w:r>
     </w:p>
     <w:p>
       <w:r>
         <w:rPr>
-          <w:rFonts w:ascii="楷体_GB2312" w:hAnsi="楷体_GB2312" w:eastAsia="楷体_GB2312"/>
           <w:b w:val="0"/>
-          <w:color w:val="996600"/>
           <w:sz w:val="24"/>
         </w:rPr>
-        <w:t>📺 画面：PPT第2页——痛点→方案→功能→成果</w:t>
-      </w:r>
-    </w:p>
-    <w:p>
-      <w:pPr>
-        <w:spacing w:line="480" w:lineRule="exact"/>
-        <w:ind w:firstLine="420"/>
-      </w:pPr>
-      <w:r>
-        <w:rPr>
-          <w:rFonts w:ascii="仿宋_GB2312" w:hAnsi="仿宋_GB2312" w:eastAsia="仿宋_GB2312"/>
-          <w:b w:val="0"/>
-          <w:sz w:val="28"/>
-        </w:rPr>
-        <w:t>先说说我做这个工具的起因。四年级做动物类习作训练时，我有一个班48个学生。一节课40分钟，我没办法给每个孩子单独指导怎么写。写完之后，我批改48篇作文要花四到六个小时，等改完发回去，孩子们早就不想改了。另外，课堂上的范文就那么三五篇，好词好句写在黑板上，下了课就忘了。</w:t>
-      </w:r>
-    </w:p>
-    <w:p>
-      <w:pPr>
-        <w:spacing w:line="480" w:lineRule="exact"/>
-        <w:ind w:firstLine="420"/>
-      </w:pPr>
-      <w:r>
-        <w:rPr>
-          <w:rFonts w:ascii="仿宋_GB2312" w:hAnsi="仿宋_GB2312" w:eastAsia="仿宋_GB2312"/>
-          <w:b w:val="0"/>
-          <w:sz w:val="28"/>
-        </w:rPr>
-        <w:t>这些问题让我想到——能不能借助AI来解决？2025年以来，国产大模型发展很快，DeepSeek的API可以调用编程，所以我用Python的Flask框架，开发了这个《动物习作AI智能助教》。它完全运行在本地笔记本上，不需要部署服务器。</w:t>
-      </w:r>
-    </w:p>
-    <w:p>
-      <w:pPr>
-        <w:spacing w:line="480" w:lineRule="exact"/>
-        <w:ind w:firstLine="420"/>
-      </w:pPr>
-      <w:r>
-        <w:rPr>
-          <w:rFonts w:ascii="仿宋_GB2312" w:hAnsi="仿宋_GB2312" w:eastAsia="仿宋_GB2312"/>
-          <w:b w:val="0"/>
-          <w:sz w:val="28"/>
-        </w:rPr>
-        <w:t>这个工具包含四个功能：写作指导、作文批改、互动问答、范文展示。经过四年级四个班的试用，学生的作文字数平均提升了32%，主动写作的学生比例从15%提升到了40%，我自己的批改时间也减少了约60%。</w:t>
-      </w:r>
-    </w:p>
-    <w:p>
-      <w:pPr>
-        <w:spacing w:before="240"/>
-      </w:pPr>
-      <w:r>
-        <w:rPr>
-          <w:rFonts w:ascii="黑体" w:hAnsi="黑体" w:eastAsia="黑体"/>
-          <w:b/>
-          <w:sz w:val="32"/>
-        </w:rPr>
-        <w:t>【第3页 · 写作指导模块】</w:t>
       </w:r>
     </w:p>
     <w:p>
       <w:r>
         <w:rPr>
-          <w:rFonts w:ascii="楷体_GB2312" w:hAnsi="楷体_GB2312" w:eastAsia="楷体_GB2312"/>
           <w:b/>
-          <w:color w:val="CC3333"/>
-          <w:sz w:val="24"/>
+          <w:sz w:val="22"/>
         </w:rPr>
-        <w:t>⏱ 1分15秒</w:t>
+        <w:t>── 第2页 案例概述（1分30秒） ──</w:t>
       </w:r>
     </w:p>
     <w:p>
       <w:r>
         <w:rPr>
-          <w:rFonts w:ascii="楷体_GB2312" w:hAnsi="楷体_GB2312" w:eastAsia="楷体_GB2312"/>
           <w:b w:val="0"/>
-          <w:color w:val="996600"/>
-          <w:sz w:val="24"/>
+          <w:sz w:val="20"/>
         </w:rPr>
-        <w:t>📺 画面：PPT第3页（子标题页）→ 切入录屏演示</w:t>
-      </w:r>
-    </w:p>
-    <w:p>
-      <w:pPr>
-        <w:spacing w:line="480" w:lineRule="exact"/>
-        <w:ind w:firstLine="420"/>
-      </w:pPr>
-      <w:r>
-        <w:rPr>
-          <w:rFonts w:ascii="仿宋_GB2312" w:hAnsi="仿宋_GB2312" w:eastAsia="仿宋_GB2312"/>
-          <w:b w:val="0"/>
-          <w:sz w:val="28"/>
-        </w:rPr>
-        <w:t>第一个功能——写作指导。我们来看具体操作。</w:t>
-      </w:r>
-    </w:p>
-    <w:p>
-      <w:pPr>
-        <w:spacing w:line="480" w:lineRule="exact"/>
-        <w:ind w:firstLine="420"/>
-      </w:pPr>
-      <w:r>
-        <w:rPr>
-          <w:rFonts w:ascii="仿宋_GB2312" w:hAnsi="仿宋_GB2312" w:eastAsia="仿宋_GB2312"/>
-          <w:b w:val="0"/>
-          <w:sz w:val="28"/>
-        </w:rPr>
-        <w:t>在写作指导页面，输入你想描写的动物名称，比如"小白兔"，如果还有更具体的要求，可以在下面的框里补充。点击"获取写作指导"。</w:t>
-      </w:r>
-    </w:p>
-    <w:p>
-      <w:pPr>
-        <w:spacing w:line="480" w:lineRule="exact"/>
-        <w:ind w:firstLine="420"/>
-      </w:pPr>
-      <w:r>
-        <w:rPr>
-          <w:rFonts w:ascii="仿宋_GB2312" w:hAnsi="仿宋_GB2312" w:eastAsia="仿宋_GB2312"/>
-          <w:b w:val="0"/>
-          <w:sz w:val="28"/>
-        </w:rPr>
-        <w:t>大家看，AI的回复分四个部分：外形怎么写、生活习性怎么写、推荐哪些好词好句、用什么结构来组织文章。每个学生输入不同动物，得到的指导都是量身定做的。</w:t>
-      </w:r>
-    </w:p>
-    <w:p>
-      <w:pPr>
-        <w:spacing w:line="480" w:lineRule="exact"/>
-        <w:ind w:firstLine="420"/>
-      </w:pPr>
-      <w:r>
-        <w:rPr>
-          <w:rFonts w:ascii="仿宋_GB2312" w:hAnsi="仿宋_GB2312" w:eastAsia="仿宋_GB2312"/>
-          <w:b w:val="0"/>
-          <w:sz w:val="28"/>
-        </w:rPr>
-        <w:t>这就相当于——每个学生都有了一个AI老师在身边一对一辅导。原来我只能讲一个模板全班用，现在每个孩子都能得到针对性的建议。</w:t>
-      </w:r>
-    </w:p>
-    <w:p>
-      <w:pPr>
-        <w:spacing w:before="240"/>
-      </w:pPr>
-      <w:r>
-        <w:rPr>
-          <w:rFonts w:ascii="黑体" w:hAnsi="黑体" w:eastAsia="黑体"/>
-          <w:b/>
-          <w:sz w:val="32"/>
-        </w:rPr>
-        <w:t>【第4页 · 作文批改】</w:t>
+        <w:t>画面：PPT第2页</w:t>
       </w:r>
     </w:p>
     <w:p>
       <w:r>
         <w:rPr>
-          <w:rFonts w:ascii="楷体_GB2312" w:hAnsi="楷体_GB2312" w:eastAsia="楷体_GB2312"/>
-          <w:b/>
-          <w:color w:val="CC3333"/>
-          <w:sz w:val="24"/>
+          <w:b w:val="0"/>
+          <w:sz w:val="20"/>
         </w:rPr>
-        <w:t>⏱ 1分15秒</w:t>
+        <w:t>内容：痛点（个性化不足、反馈慢、资源少）→ 方案（DeepSeek V4 Pro + Flask）→ 五大功能模块 → 四组数据 → 政策合规 + MIT开源 → GitHub</w:t>
       </w:r>
     </w:p>
     <w:p>
       <w:r>
         <w:rPr>
-          <w:rFonts w:ascii="楷体_GB2312" w:hAnsi="楷体_GB2312" w:eastAsia="楷体_GB2312"/>
           <w:b w:val="0"/>
-          <w:color w:val="996600"/>
-          <w:sz w:val="24"/>
+          <w:sz w:val="20"/>
         </w:rPr>
-        <w:t>📺 画面：PPT第4页快速带过 → 切入录屏批改操作</w:t>
-      </w:r>
-    </w:p>
-    <w:p>
-      <w:pPr>
-        <w:spacing w:line="480" w:lineRule="exact"/>
-        <w:ind w:firstLine="420"/>
-      </w:pPr>
-      <w:r>
-        <w:rPr>
-          <w:rFonts w:ascii="仿宋_GB2312" w:hAnsi="仿宋_GB2312" w:eastAsia="仿宋_GB2312"/>
-          <w:b w:val="0"/>
-          <w:sz w:val="28"/>
-        </w:rPr>
-        <w:t>第二个功能——作文批改。以刚才"小白兔"的题目为例，假设一个学生写了这样一篇习作。把作文粘贴进来，点击"开始批改"。大家看，几秒钟后AI就给出了批改结果：总体评价、内容完整性、语言表达、情感表达、改进建议，五个维度都有了。</w:t>
-      </w:r>
-    </w:p>
-    <w:p>
-      <w:pPr>
-        <w:spacing w:line="480" w:lineRule="exact"/>
-        <w:ind w:firstLine="420"/>
-      </w:pPr>
-      <w:r>
-        <w:rPr>
-          <w:rFonts w:ascii="仿宋_GB2312" w:hAnsi="仿宋_GB2312" w:eastAsia="仿宋_GB2312"/>
-          <w:b w:val="0"/>
-          <w:sz w:val="28"/>
-        </w:rPr>
-        <w:t>我特别设计了批改的语气——先肯定优点，再温和地提建议。比如它不会直接说"你写得不好"，而是说"你的外形描写比较到位，如果再加上一个你和它之间的小故事，作文会更生动"。这样保护了孩子的写作积极性。学生收到反馈后可以立即修改，形成了"写→反馈→修改"的即时闭环。</w:t>
-      </w:r>
-    </w:p>
-    <w:p>
-      <w:pPr>
-        <w:spacing w:before="240"/>
-      </w:pPr>
-      <w:r>
-        <w:rPr>
-          <w:rFonts w:ascii="黑体" w:hAnsi="黑体" w:eastAsia="黑体"/>
-          <w:b/>
-          <w:sz w:val="32"/>
-        </w:rPr>
-        <w:t>【第5页 · 互动问答与范文展示】</w:t>
       </w:r>
     </w:p>
     <w:p>
       <w:r>
         <w:rPr>
-          <w:rFonts w:ascii="楷体_GB2312" w:hAnsi="楷体_GB2312" w:eastAsia="楷体_GB2312"/>
-          <w:b/>
-          <w:color w:val="CC3333"/>
-          <w:sz w:val="24"/>
+          <w:b w:val="0"/>
+          <w:sz w:val="20"/>
         </w:rPr>
-        <w:t>⏱ 2分钟</w:t>
+        <w:t>解说：先说我做这个工具的起因。四年级动物习作，48个学生无法逐一指导；批改48篇作文要四到六小时。我用DeepSeek V4 Pro旗舰模型，通过Flask开发了本地工具。五个模块：写作闯关、好词好句墙、写作分析建议、互动问答、范文展示。试用数据：字数提升32%，主动写作从15%到40%，批改时间减少60%。本工具遵循《使用指南》，MIT开源，代码在GitHub上公开。</w:t>
       </w:r>
     </w:p>
     <w:p>
       <w:r>
         <w:rPr>
-          <w:rFonts w:ascii="楷体_GB2312" w:hAnsi="楷体_GB2312" w:eastAsia="楷体_GB2312"/>
           <w:b w:val="0"/>
-          <w:color w:val="996600"/>
           <w:sz w:val="24"/>
         </w:rPr>
-        <w:t>📺 画面：PPT第5页 → 先切互动问答录屏 → 再切范文展示录屏</w:t>
-      </w:r>
-    </w:p>
-    <w:p>
-      <w:pPr>
-        <w:spacing w:line="480" w:lineRule="exact"/>
-        <w:ind w:firstLine="420"/>
-      </w:pPr>
-      <w:r>
-        <w:rPr>
-          <w:rFonts w:ascii="仿宋_GB2312" w:hAnsi="仿宋_GB2312" w:eastAsia="仿宋_GB2312"/>
-          <w:b w:val="0"/>
-          <w:sz w:val="28"/>
-        </w:rPr>
-        <w:t>第三个功能——互动问答。这是学生最喜欢的功能。</w:t>
-      </w:r>
-    </w:p>
-    <w:p>
-      <w:pPr>
-        <w:spacing w:line="480" w:lineRule="exact"/>
-        <w:ind w:firstLine="420"/>
-      </w:pPr>
-      <w:r>
-        <w:rPr>
-          <w:rFonts w:ascii="仿宋_GB2312" w:hAnsi="仿宋_GB2312" w:eastAsia="仿宋_GB2312"/>
-          <w:b w:val="0"/>
-          <w:sz w:val="28"/>
-        </w:rPr>
-        <w:t>比如学生问"怎么描写动物的外形"，AI会告诉他按"先整体后局部"的顺序来写。还可以继续追问——"有哪些好词好句"？AI马上推荐一批描写动物的词语。再问"开头怎么写"，AI也给出几种开头的方法。而且它支持多轮对话，学生可以一直追问下去，就像有个AI老师在身边随时答疑。</w:t>
-      </w:r>
-    </w:p>
-    <w:p>
-      <w:pPr>
-        <w:spacing w:line="480" w:lineRule="exact"/>
-        <w:ind w:firstLine="420"/>
-      </w:pPr>
-      <w:r>
-        <w:rPr>
-          <w:rFonts w:ascii="仿宋_GB2312" w:hAnsi="仿宋_GB2312" w:eastAsia="仿宋_GB2312"/>
-          <w:b w:val="0"/>
-          <w:sz w:val="28"/>
-        </w:rPr>
-        <w:t>第四个功能是范文展示。这里预置了三篇优秀的学生范文：小狗、大熊猫、小蜜蜂，分别对应宠物类、观赏类、昆虫类三种常见题材。点击范文可以看完整内容。这个范文库可以不断扩充，以后每个单元都能用。</w:t>
-      </w:r>
-    </w:p>
-    <w:p>
-      <w:pPr>
-        <w:spacing w:before="240"/>
-      </w:pPr>
-      <w:r>
-        <w:rPr>
-          <w:rFonts w:ascii="黑体" w:hAnsi="黑体" w:eastAsia="黑体"/>
-          <w:b/>
-          <w:sz w:val="32"/>
-        </w:rPr>
-        <w:t>【第6页 · 应用场景概述】</w:t>
       </w:r>
     </w:p>
     <w:p>
       <w:r>
         <w:rPr>
-          <w:rFonts w:ascii="楷体_GB2312" w:hAnsi="楷体_GB2312" w:eastAsia="楷体_GB2312"/>
           <w:b/>
-          <w:color w:val="CC3333"/>
-          <w:sz w:val="24"/>
+          <w:sz w:val="22"/>
         </w:rPr>
-        <w:t>⏱ 30秒</w:t>
+        <w:t>── 第3页 写作闯关（1分钟） ──</w:t>
       </w:r>
     </w:p>
     <w:p>
       <w:r>
         <w:rPr>
-          <w:rFonts w:ascii="楷体_GB2312" w:hAnsi="楷体_GB2312" w:eastAsia="楷体_GB2312"/>
           <w:b w:val="0"/>
-          <w:color w:val="996600"/>
-          <w:sz w:val="24"/>
+          <w:sz w:val="20"/>
         </w:rPr>
-        <w:t>📺 画面：PPT第6页——三个应用场景 + 数据</w:t>
-      </w:r>
-    </w:p>
-    <w:p>
-      <w:pPr>
-        <w:spacing w:line="480" w:lineRule="exact"/>
-        <w:ind w:firstLine="420"/>
-      </w:pPr>
-      <w:r>
-        <w:rPr>
-          <w:rFonts w:ascii="仿宋_GB2312" w:hAnsi="仿宋_GB2312" w:eastAsia="仿宋_GB2312"/>
-          <w:b w:val="0"/>
-          <w:sz w:val="28"/>
-        </w:rPr>
-        <w:t>我的工具从四月中旬开始在四年级四个班级试用，覆盖了大约180名学生。主要用在三个场景：课堂上，学生用AI获取个性化写作指导；课后，学生写完作文用AI批改、修改；在课后服务时间，孩子们自己使用问答功能做写作练习。从课堂到课后，形成了一个完整的使用链条。</w:t>
-      </w:r>
-    </w:p>
-    <w:p>
-      <w:pPr>
-        <w:spacing w:before="240"/>
-      </w:pPr>
-      <w:r>
-        <w:rPr>
-          <w:rFonts w:ascii="黑体" w:hAnsi="黑体" w:eastAsia="黑体"/>
-          <w:b/>
-          <w:sz w:val="32"/>
-        </w:rPr>
-        <w:t>【第7页 · 课堂应用】</w:t>
+        <w:t>画面：PPT第3页 → 切入录屏</w:t>
       </w:r>
     </w:p>
     <w:p>
       <w:r>
         <w:rPr>
-          <w:rFonts w:ascii="楷体_GB2312" w:hAnsi="楷体_GB2312" w:eastAsia="楷体_GB2312"/>
-          <w:b/>
-          <w:color w:val="CC3333"/>
-          <w:sz w:val="24"/>
+          <w:b w:val="0"/>
+          <w:sz w:val="20"/>
         </w:rPr>
-        <w:t>⏱ 30秒</w:t>
+        <w:t>内容：五步引导 + 进度条 + 推荐词语 + 鼓励弹窗</w:t>
       </w:r>
     </w:p>
     <w:p>
       <w:r>
         <w:rPr>
-          <w:rFonts w:ascii="楷体_GB2312" w:hAnsi="楷体_GB2312" w:eastAsia="楷体_GB2312"/>
           <w:b w:val="0"/>
-          <w:color w:val="996600"/>
-          <w:sz w:val="24"/>
+          <w:sz w:val="20"/>
         </w:rPr>
-        <w:t>📺 画面：PPT第7页——课堂应用 + 应用情况标签</w:t>
-      </w:r>
-    </w:p>
-    <w:p>
-      <w:pPr>
-        <w:spacing w:line="480" w:lineRule="exact"/>
-        <w:ind w:firstLine="420"/>
-      </w:pPr>
-      <w:r>
-        <w:rPr>
-          <w:rFonts w:ascii="仿宋_GB2312" w:hAnsi="仿宋_GB2312" w:eastAsia="仿宋_GB2312"/>
-          <w:b w:val="0"/>
-          <w:sz w:val="28"/>
-        </w:rPr>
-        <w:t>具体来说，在习作指导课上，每个学生输入自己想写的动物，AI就生成针对性的指导。一个平时写作比较吃力的学生输入"仓鼠"后，AI不仅给出了外形建议，还推荐了"毛茸茸""圆滚滚"这些适合他的词，让他写作的时候有了抓手。以前我只能一个一个辅导，时间根本不够用。现在全班同时用AI辅导，覆盖面大了很多。</w:t>
-      </w:r>
-    </w:p>
-    <w:p>
-      <w:pPr>
-        <w:spacing w:before="240"/>
-      </w:pPr>
-      <w:r>
-        <w:rPr>
-          <w:rFonts w:ascii="黑体" w:hAnsi="黑体" w:eastAsia="黑体"/>
-          <w:b/>
-          <w:sz w:val="32"/>
-        </w:rPr>
-        <w:t>【第8页 · 应用效果】</w:t>
       </w:r>
     </w:p>
     <w:p>
       <w:r>
         <w:rPr>
-          <w:rFonts w:ascii="楷体_GB2312" w:hAnsi="楷体_GB2312" w:eastAsia="楷体_GB2312"/>
-          <w:b/>
-          <w:color w:val="CC3333"/>
-          <w:sz w:val="24"/>
+          <w:b w:val="0"/>
+          <w:sz w:val="20"/>
         </w:rPr>
-        <w:t>⏱ 30秒</w:t>
+        <w:t>解说：写作闯关把写作分成五步。输入动物名，点下一步。每步有引导问题、小窍门、推荐词语。点击词语可加入好词墙。完成有鼓励弹窗。</w:t>
       </w:r>
     </w:p>
     <w:p>
       <w:r>
         <w:rPr>
-          <w:rFonts w:ascii="楷体_GB2312" w:hAnsi="楷体_GB2312" w:eastAsia="楷体_GB2312"/>
           <w:b w:val="0"/>
-          <w:color w:val="996600"/>
           <w:sz w:val="24"/>
         </w:rPr>
-        <w:t>📺 画面：PPT第8页——四组数据 + 应用情况标签</w:t>
-      </w:r>
-    </w:p>
-    <w:p>
-      <w:pPr>
-        <w:spacing w:line="480" w:lineRule="exact"/>
-        <w:ind w:firstLine="420"/>
-      </w:pPr>
-      <w:r>
-        <w:rPr>
-          <w:rFonts w:ascii="仿宋_GB2312" w:hAnsi="仿宋_GB2312" w:eastAsia="仿宋_GB2312"/>
-          <w:b w:val="0"/>
-          <w:sz w:val="28"/>
-        </w:rPr>
-        <w:t>经过三周的使用，效果很实在。学生作文从原来的"四五句话、干巴巴"，变成了"一段段、有内容"。具体来说：学生作文字数平均提升了32%，主动写作的学生比例从不足15%提升到了40%左右，我自己的批改时间减少了约60%，可以把更多精力放在面对面辅导上。</w:t>
-      </w:r>
-    </w:p>
-    <w:p>
-      <w:pPr>
-        <w:spacing w:before="240"/>
-      </w:pPr>
-      <w:r>
-        <w:rPr>
-          <w:rFonts w:ascii="黑体" w:hAnsi="黑体" w:eastAsia="黑体"/>
-          <w:b/>
-          <w:sz w:val="32"/>
-        </w:rPr>
-        <w:t>【第9页 · 致谢】</w:t>
       </w:r>
     </w:p>
     <w:p>
       <w:r>
         <w:rPr>
-          <w:rFonts w:ascii="楷体_GB2312" w:hAnsi="楷体_GB2312" w:eastAsia="楷体_GB2312"/>
           <w:b/>
-          <w:color w:val="CC3333"/>
-          <w:sz w:val="24"/>
+          <w:sz w:val="22"/>
         </w:rPr>
-        <w:t>⏱ 5秒</w:t>
+        <w:t>── 第4页 好词好句墙+课本好句（1分钟） ──</w:t>
       </w:r>
     </w:p>
     <w:p>
       <w:r>
         <w:rPr>
-          <w:rFonts w:ascii="楷体_GB2312" w:hAnsi="楷体_GB2312" w:eastAsia="楷体_GB2312"/>
           <w:b w:val="0"/>
-          <w:color w:val="996600"/>
-          <w:sz w:val="24"/>
+          <w:sz w:val="20"/>
         </w:rPr>
-        <w:t>📺 画面：PPT第9页——谢谢！</w:t>
-      </w:r>
-    </w:p>
-    <w:p>
-      <w:pPr>
-        <w:spacing w:line="480" w:lineRule="exact"/>
-        <w:ind w:firstLine="420"/>
-      </w:pPr>
-      <w:r>
-        <w:rPr>
-          <w:rFonts w:ascii="仿宋_GB2312" w:hAnsi="仿宋_GB2312" w:eastAsia="仿宋_GB2312"/>
-          <w:b w:val="0"/>
-          <w:sz w:val="28"/>
-        </w:rPr>
-        <w:t>以上就是我的案例汇报，谢谢大家！</w:t>
-      </w:r>
-    </w:p>
-    <w:p>
-      <w:r>
-        <w:br w:type="page"/>
-      </w:r>
-    </w:p>
-    <w:p>
-      <w:pPr>
-        <w:spacing w:before="240"/>
-      </w:pPr>
-      <w:r>
-        <w:rPr>
-          <w:rFonts w:ascii="黑体" w:hAnsi="黑体" w:eastAsia="黑体"/>
-          <w:b/>
-          <w:sz w:val="32"/>
-        </w:rPr>
-        <w:t>附录：时间分配对照表</w:t>
-      </w:r>
-    </w:p>
-    <w:tbl>
-      <w:tblPr>
-        <w:tblStyle w:val="TableGrid"/>
-        <w:tblW w:type="auto" w:w="0"/>
-        <w:tblLook w:firstColumn="1" w:firstRow="1" w:lastColumn="0" w:lastRow="0" w:noHBand="0" w:noVBand="1" w:val="04A0"/>
-      </w:tblPr>
-      <w:tblGrid>
-        <w:gridCol w:w="2340"/>
-        <w:gridCol w:w="2340"/>
-        <w:gridCol w:w="2340"/>
-        <w:gridCol w:w="2340"/>
-      </w:tblGrid>
-      <w:tr>
-        <w:tc>
-          <w:tcPr>
-            <w:tcW w:type="dxa" w:w="2340"/>
-          </w:tcPr>
-          <w:p>
-            <w:r>
-              <w:rPr>
-                <w:rFonts w:ascii="仿宋_GB2312" w:hAnsi="仿宋_GB2312"/>
-                <w:b/>
-                <w:sz w:val="24"/>
-              </w:rPr>
-              <w:t>第1页</w:t>
-            </w:r>
-          </w:p>
-        </w:tc>
-        <w:tc>
-          <w:tcPr>
-            <w:tcW w:type="dxa" w:w="2340"/>
-          </w:tcPr>
-          <w:p>
-            <w:r>
-              <w:rPr>
-                <w:rFonts w:ascii="仿宋_GB2312" w:hAnsi="仿宋_GB2312"/>
-                <w:b/>
-                <w:sz w:val="24"/>
-              </w:rPr>
-              <w:t>封面</w:t>
-            </w:r>
-          </w:p>
-        </w:tc>
-        <w:tc>
-          <w:tcPr>
-            <w:tcW w:type="dxa" w:w="2340"/>
-          </w:tcPr>
-          <w:p>
-            <w:r>
-              <w:rPr>
-                <w:rFonts w:ascii="仿宋_GB2312" w:hAnsi="仿宋_GB2312"/>
-                <w:b/>
-                <w:sz w:val="24"/>
-              </w:rPr>
-              <w:t>15秒</w:t>
-            </w:r>
-          </w:p>
-        </w:tc>
-        <w:tc>
-          <w:tcPr>
-            <w:tcW w:type="dxa" w:w="2340"/>
-          </w:tcPr>
-          <w:p>
-            <w:r>
-              <w:rPr>
-                <w:rFonts w:ascii="仿宋_GB2312" w:hAnsi="仿宋_GB2312"/>
-                <w:b/>
-                <w:sz w:val="24"/>
-              </w:rPr>
-              <w:t>PPT</w:t>
-            </w:r>
-          </w:p>
-        </w:tc>
-      </w:tr>
-      <w:tr>
-        <w:tc>
-          <w:tcPr>
-            <w:tcW w:type="dxa" w:w="2340"/>
-          </w:tcPr>
-          <w:p>
-            <w:r>
-              <w:rPr>
-                <w:rFonts w:ascii="仿宋_GB2312" w:hAnsi="仿宋_GB2312"/>
-                <w:sz w:val="24"/>
-              </w:rPr>
-              <w:t>第2页</w:t>
-            </w:r>
-          </w:p>
-        </w:tc>
-        <w:tc>
-          <w:tcPr>
-            <w:tcW w:type="dxa" w:w="2340"/>
-          </w:tcPr>
-          <w:p>
-            <w:r>
-              <w:rPr>
-                <w:rFonts w:ascii="仿宋_GB2312" w:hAnsi="仿宋_GB2312"/>
-                <w:sz w:val="24"/>
-              </w:rPr>
-              <w:t>案例概述</w:t>
-            </w:r>
-          </w:p>
-        </w:tc>
-        <w:tc>
-          <w:tcPr>
-            <w:tcW w:type="dxa" w:w="2340"/>
-          </w:tcPr>
-          <w:p>
-            <w:r>
-              <w:rPr>
-                <w:rFonts w:ascii="仿宋_GB2312" w:hAnsi="仿宋_GB2312"/>
-                <w:sz w:val="24"/>
-              </w:rPr>
-              <w:t>1分45秒</w:t>
-            </w:r>
-          </w:p>
-        </w:tc>
-        <w:tc>
-          <w:tcPr>
-            <w:tcW w:type="dxa" w:w="2340"/>
-          </w:tcPr>
-          <w:p>
-            <w:r>
-              <w:rPr>
-                <w:rFonts w:ascii="仿宋_GB2312" w:hAnsi="仿宋_GB2312"/>
-                <w:sz w:val="24"/>
-              </w:rPr>
-              <w:t>PPT</w:t>
-            </w:r>
-          </w:p>
-        </w:tc>
-      </w:tr>
-      <w:tr>
-        <w:tc>
-          <w:tcPr>
-            <w:tcW w:type="dxa" w:w="2340"/>
-          </w:tcPr>
-          <w:p>
-            <w:r>
-              <w:rPr>
-                <w:rFonts w:ascii="仿宋_GB2312" w:hAnsi="仿宋_GB2312"/>
-                <w:sz w:val="24"/>
-              </w:rPr>
-              <w:t>第3页</w:t>
-            </w:r>
-          </w:p>
-        </w:tc>
-        <w:tc>
-          <w:tcPr>
-            <w:tcW w:type="dxa" w:w="2340"/>
-          </w:tcPr>
-          <w:p>
-            <w:r>
-              <w:rPr>
-                <w:rFonts w:ascii="仿宋_GB2312" w:hAnsi="仿宋_GB2312"/>
-                <w:sz w:val="24"/>
-              </w:rPr>
-              <w:t>写作指导</w:t>
-            </w:r>
-          </w:p>
-        </w:tc>
-        <w:tc>
-          <w:tcPr>
-            <w:tcW w:type="dxa" w:w="2340"/>
-          </w:tcPr>
-          <w:p>
-            <w:r>
-              <w:rPr>
-                <w:rFonts w:ascii="仿宋_GB2312" w:hAnsi="仿宋_GB2312"/>
-                <w:sz w:val="24"/>
-              </w:rPr>
-              <w:t>1分15秒</w:t>
-            </w:r>
-          </w:p>
-        </w:tc>
-        <w:tc>
-          <w:tcPr>
-            <w:tcW w:type="dxa" w:w="2340"/>
-          </w:tcPr>
-          <w:p>
-            <w:r>
-              <w:rPr>
-                <w:rFonts w:ascii="仿宋_GB2312" w:hAnsi="仿宋_GB2312"/>
-                <w:sz w:val="24"/>
-              </w:rPr>
-              <w:t>PPT → 切入录屏</w:t>
-            </w:r>
-          </w:p>
-        </w:tc>
-      </w:tr>
-      <w:tr>
-        <w:tc>
-          <w:tcPr>
-            <w:tcW w:type="dxa" w:w="2340"/>
-          </w:tcPr>
-          <w:p>
-            <w:r>
-              <w:rPr>
-                <w:rFonts w:ascii="仿宋_GB2312" w:hAnsi="仿宋_GB2312"/>
-                <w:sz w:val="24"/>
-              </w:rPr>
-              <w:t>第4页</w:t>
-            </w:r>
-          </w:p>
-        </w:tc>
-        <w:tc>
-          <w:tcPr>
-            <w:tcW w:type="dxa" w:w="2340"/>
-          </w:tcPr>
-          <w:p>
-            <w:r>
-              <w:rPr>
-                <w:rFonts w:ascii="仿宋_GB2312" w:hAnsi="仿宋_GB2312"/>
-                <w:sz w:val="24"/>
-              </w:rPr>
-              <w:t>作文批改</w:t>
-            </w:r>
-          </w:p>
-        </w:tc>
-        <w:tc>
-          <w:tcPr>
-            <w:tcW w:type="dxa" w:w="2340"/>
-          </w:tcPr>
-          <w:p>
-            <w:r>
-              <w:rPr>
-                <w:rFonts w:ascii="仿宋_GB2312" w:hAnsi="仿宋_GB2312"/>
-                <w:sz w:val="24"/>
-              </w:rPr>
-              <w:t>1分15秒</w:t>
-            </w:r>
-          </w:p>
-        </w:tc>
-        <w:tc>
-          <w:tcPr>
-            <w:tcW w:type="dxa" w:w="2340"/>
-          </w:tcPr>
-          <w:p>
-            <w:r>
-              <w:rPr>
-                <w:rFonts w:ascii="仿宋_GB2312" w:hAnsi="仿宋_GB2312"/>
-                <w:sz w:val="24"/>
-              </w:rPr>
-              <w:t>PPT → 切入录屏</w:t>
-            </w:r>
-          </w:p>
-        </w:tc>
-      </w:tr>
-      <w:tr>
-        <w:tc>
-          <w:tcPr>
-            <w:tcW w:type="dxa" w:w="2340"/>
-          </w:tcPr>
-          <w:p>
-            <w:r>
-              <w:rPr>
-                <w:rFonts w:ascii="仿宋_GB2312" w:hAnsi="仿宋_GB2312"/>
-                <w:sz w:val="24"/>
-              </w:rPr>
-              <w:t>第5页</w:t>
-            </w:r>
-          </w:p>
-        </w:tc>
-        <w:tc>
-          <w:tcPr>
-            <w:tcW w:type="dxa" w:w="2340"/>
-          </w:tcPr>
-          <w:p>
-            <w:r>
-              <w:rPr>
-                <w:rFonts w:ascii="仿宋_GB2312" w:hAnsi="仿宋_GB2312"/>
-                <w:sz w:val="24"/>
-              </w:rPr>
-              <w:t>问答+范文</w:t>
-            </w:r>
-          </w:p>
-        </w:tc>
-        <w:tc>
-          <w:tcPr>
-            <w:tcW w:type="dxa" w:w="2340"/>
-          </w:tcPr>
-          <w:p>
-            <w:r>
-              <w:rPr>
-                <w:rFonts w:ascii="仿宋_GB2312" w:hAnsi="仿宋_GB2312"/>
-                <w:sz w:val="24"/>
-              </w:rPr>
-              <w:t>2分00秒</w:t>
-            </w:r>
-          </w:p>
-        </w:tc>
-        <w:tc>
-          <w:tcPr>
-            <w:tcW w:type="dxa" w:w="2340"/>
-          </w:tcPr>
-          <w:p>
-            <w:r>
-              <w:rPr>
-                <w:rFonts w:ascii="仿宋_GB2312" w:hAnsi="仿宋_GB2312"/>
-                <w:sz w:val="24"/>
-              </w:rPr>
-              <w:t>PPT → 切入录屏</w:t>
-            </w:r>
-          </w:p>
-        </w:tc>
-      </w:tr>
-      <w:tr>
-        <w:tc>
-          <w:tcPr>
-            <w:tcW w:type="dxa" w:w="2340"/>
-          </w:tcPr>
-          <w:p>
-            <w:r>
-              <w:rPr>
-                <w:rFonts w:ascii="仿宋_GB2312" w:hAnsi="仿宋_GB2312"/>
-                <w:sz w:val="24"/>
-              </w:rPr>
-              <w:t>第6页</w:t>
-            </w:r>
-          </w:p>
-        </w:tc>
-        <w:tc>
-          <w:tcPr>
-            <w:tcW w:type="dxa" w:w="2340"/>
-          </w:tcPr>
-          <w:p>
-            <w:r>
-              <w:rPr>
-                <w:rFonts w:ascii="仿宋_GB2312" w:hAnsi="仿宋_GB2312"/>
-                <w:sz w:val="24"/>
-              </w:rPr>
-              <w:t>应用场景概述</w:t>
-            </w:r>
-          </w:p>
-        </w:tc>
-        <w:tc>
-          <w:tcPr>
-            <w:tcW w:type="dxa" w:w="2340"/>
-          </w:tcPr>
-          <w:p>
-            <w:r>
-              <w:rPr>
-                <w:rFonts w:ascii="仿宋_GB2312" w:hAnsi="仿宋_GB2312"/>
-                <w:sz w:val="24"/>
-              </w:rPr>
-              <w:t>30秒</w:t>
-            </w:r>
-          </w:p>
-        </w:tc>
-        <w:tc>
-          <w:tcPr>
-            <w:tcW w:type="dxa" w:w="2340"/>
-          </w:tcPr>
-          <w:p>
-            <w:r>
-              <w:rPr>
-                <w:rFonts w:ascii="仿宋_GB2312" w:hAnsi="仿宋_GB2312"/>
-                <w:sz w:val="24"/>
-              </w:rPr>
-              <w:t>PPT</w:t>
-            </w:r>
-          </w:p>
-        </w:tc>
-      </w:tr>
-      <w:tr>
-        <w:tc>
-          <w:tcPr>
-            <w:tcW w:type="dxa" w:w="2340"/>
-          </w:tcPr>
-          <w:p>
-            <w:r>
-              <w:rPr>
-                <w:rFonts w:ascii="仿宋_GB2312" w:hAnsi="仿宋_GB2312"/>
-                <w:sz w:val="24"/>
-              </w:rPr>
-              <w:t>第7页</w:t>
-            </w:r>
-          </w:p>
-        </w:tc>
-        <w:tc>
-          <w:tcPr>
-            <w:tcW w:type="dxa" w:w="2340"/>
-          </w:tcPr>
-          <w:p>
-            <w:r>
-              <w:rPr>
-                <w:rFonts w:ascii="仿宋_GB2312" w:hAnsi="仿宋_GB2312"/>
-                <w:sz w:val="24"/>
-              </w:rPr>
-              <w:t>课堂应用</w:t>
-            </w:r>
-          </w:p>
-        </w:tc>
-        <w:tc>
-          <w:tcPr>
-            <w:tcW w:type="dxa" w:w="2340"/>
-          </w:tcPr>
-          <w:p>
-            <w:r>
-              <w:rPr>
-                <w:rFonts w:ascii="仿宋_GB2312" w:hAnsi="仿宋_GB2312"/>
-                <w:sz w:val="24"/>
-              </w:rPr>
-              <w:t>30秒</w:t>
-            </w:r>
-          </w:p>
-        </w:tc>
-        <w:tc>
-          <w:tcPr>
-            <w:tcW w:type="dxa" w:w="2340"/>
-          </w:tcPr>
-          <w:p>
-            <w:r>
-              <w:rPr>
-                <w:rFonts w:ascii="仿宋_GB2312" w:hAnsi="仿宋_GB2312"/>
-                <w:sz w:val="24"/>
-              </w:rPr>
-              <w:t>PPT</w:t>
-            </w:r>
-          </w:p>
-        </w:tc>
-      </w:tr>
-      <w:tr>
-        <w:tc>
-          <w:tcPr>
-            <w:tcW w:type="dxa" w:w="2340"/>
-          </w:tcPr>
-          <w:p>
-            <w:r>
-              <w:rPr>
-                <w:rFonts w:ascii="仿宋_GB2312" w:hAnsi="仿宋_GB2312"/>
-                <w:sz w:val="24"/>
-              </w:rPr>
-              <w:t>第8页</w:t>
-            </w:r>
-          </w:p>
-        </w:tc>
-        <w:tc>
-          <w:tcPr>
-            <w:tcW w:type="dxa" w:w="2340"/>
-          </w:tcPr>
-          <w:p>
-            <w:r>
-              <w:rPr>
-                <w:rFonts w:ascii="仿宋_GB2312" w:hAnsi="仿宋_GB2312"/>
-                <w:sz w:val="24"/>
-              </w:rPr>
-              <w:t>应用效果</w:t>
-            </w:r>
-          </w:p>
-        </w:tc>
-        <w:tc>
-          <w:tcPr>
-            <w:tcW w:type="dxa" w:w="2340"/>
-          </w:tcPr>
-          <w:p>
-            <w:r>
-              <w:rPr>
-                <w:rFonts w:ascii="仿宋_GB2312" w:hAnsi="仿宋_GB2312"/>
-                <w:sz w:val="24"/>
-              </w:rPr>
-              <w:t>30秒</w:t>
-            </w:r>
-          </w:p>
-        </w:tc>
-        <w:tc>
-          <w:tcPr>
-            <w:tcW w:type="dxa" w:w="2340"/>
-          </w:tcPr>
-          <w:p>
-            <w:r>
-              <w:rPr>
-                <w:rFonts w:ascii="仿宋_GB2312" w:hAnsi="仿宋_GB2312"/>
-                <w:sz w:val="24"/>
-              </w:rPr>
-              <w:t>PPT</w:t>
-            </w:r>
-          </w:p>
-        </w:tc>
-      </w:tr>
-      <w:tr>
-        <w:tc>
-          <w:tcPr>
-            <w:tcW w:type="dxa" w:w="2340"/>
-          </w:tcPr>
-          <w:p>
-            <w:r>
-              <w:rPr>
-                <w:rFonts w:ascii="仿宋_GB2312" w:hAnsi="仿宋_GB2312"/>
-                <w:sz w:val="24"/>
-              </w:rPr>
-              <w:t>第9页</w:t>
-            </w:r>
-          </w:p>
-        </w:tc>
-        <w:tc>
-          <w:tcPr>
-            <w:tcW w:type="dxa" w:w="2340"/>
-          </w:tcPr>
-          <w:p>
-            <w:r>
-              <w:rPr>
-                <w:rFonts w:ascii="仿宋_GB2312" w:hAnsi="仿宋_GB2312"/>
-                <w:sz w:val="24"/>
-              </w:rPr>
-              <w:t>致谢</w:t>
-            </w:r>
-          </w:p>
-        </w:tc>
-        <w:tc>
-          <w:tcPr>
-            <w:tcW w:type="dxa" w:w="2340"/>
-          </w:tcPr>
-          <w:p>
-            <w:r>
-              <w:rPr>
-                <w:rFonts w:ascii="仿宋_GB2312" w:hAnsi="仿宋_GB2312"/>
-                <w:sz w:val="24"/>
-              </w:rPr>
-              <w:t>5秒</w:t>
-            </w:r>
-          </w:p>
-        </w:tc>
-        <w:tc>
-          <w:tcPr>
-            <w:tcW w:type="dxa" w:w="2340"/>
-          </w:tcPr>
-          <w:p>
-            <w:r>
-              <w:rPr>
-                <w:rFonts w:ascii="仿宋_GB2312" w:hAnsi="仿宋_GB2312"/>
-                <w:sz w:val="24"/>
-              </w:rPr>
-              <w:t>PPT</w:t>
-            </w:r>
-          </w:p>
-        </w:tc>
-      </w:tr>
-      <w:tr>
-        <w:tc>
-          <w:tcPr>
-            <w:tcW w:type="dxa" w:w="2340"/>
-          </w:tcPr>
-          <w:p>
-            <w:r>
-              <w:rPr>
-                <w:rFonts w:ascii="仿宋_GB2312" w:hAnsi="仿宋_GB2312"/>
-                <w:sz w:val="24"/>
-              </w:rPr>
-              <w:t>总计</w:t>
-            </w:r>
-          </w:p>
-        </w:tc>
-        <w:tc>
-          <w:tcPr>
-            <w:tcW w:type="dxa" w:w="2340"/>
-          </w:tcPr>
-          <w:p>
-            <w:r>
-              <w:rPr>
-                <w:rFonts w:ascii="仿宋_GB2312" w:hAnsi="仿宋_GB2312"/>
-                <w:sz w:val="24"/>
-              </w:rPr>
-            </w:r>
-          </w:p>
-        </w:tc>
-        <w:tc>
-          <w:tcPr>
-            <w:tcW w:type="dxa" w:w="2340"/>
-          </w:tcPr>
-          <w:p>
-            <w:r>
-              <w:rPr>
-                <w:rFonts w:ascii="仿宋_GB2312" w:hAnsi="仿宋_GB2312"/>
-                <w:sz w:val="24"/>
-              </w:rPr>
-              <w:t>≤8分钟</w:t>
-            </w:r>
-          </w:p>
-        </w:tc>
-        <w:tc>
-          <w:tcPr>
-            <w:tcW w:type="dxa" w:w="2340"/>
-          </w:tcPr>
-          <w:p>
-            <w:r>
-              <w:rPr>
-                <w:rFonts w:ascii="仿宋_GB2312" w:hAnsi="仿宋_GB2312"/>
-                <w:sz w:val="24"/>
-              </w:rPr>
-            </w:r>
-          </w:p>
-        </w:tc>
-      </w:tr>
-      <w:tr>
-        <w:tc>
-          <w:tcPr>
-            <w:tcW w:type="dxa" w:w="2340"/>
-          </w:tcPr>
-          <w:p/>
-        </w:tc>
-        <w:tc>
-          <w:tcPr>
-            <w:tcW w:type="dxa" w:w="2340"/>
-          </w:tcPr>
-          <w:p/>
-        </w:tc>
-        <w:tc>
-          <w:tcPr>
-            <w:tcW w:type="dxa" w:w="2340"/>
-          </w:tcPr>
-          <w:p/>
-        </w:tc>
-        <w:tc>
-          <w:tcPr>
-            <w:tcW w:type="dxa" w:w="2340"/>
-          </w:tcPr>
-          <w:p/>
-        </w:tc>
-      </w:tr>
-    </w:tbl>
-    <w:p/>
-    <w:p>
-      <w:r>
-        <w:rPr>
-          <w:rFonts w:ascii="黑体" w:hAnsi="黑体" w:eastAsia="黑体"/>
-          <w:b/>
-          <w:sz w:val="28"/>
-        </w:rPr>
-        <w:t>录制提示：</w:t>
+        <w:t>画面：PPT第4页 → 切入录屏</w:t>
       </w:r>
     </w:p>
     <w:p>
       <w:r>
         <w:rPr>
-          <w:rFonts w:ascii="仿宋_GB2312" w:hAnsi="仿宋_GB2312" w:eastAsia="仿宋_GB2312"/>
           <w:b w:val="0"/>
-          <w:sz w:val="28"/>
+          <w:sz w:val="20"/>
         </w:rPr>
-        <w:t>建议按页分段录制，每说完一页可暂停，减少一次性录制的压力。说错某页只需重录该页，不需要从头再来。</w:t>
+        <w:t>内容：四大分类好词库 + 课堂添加 + 课本好句轮播</w:t>
+      </w:r>
+    </w:p>
+    <w:p>
+      <w:r>
+        <w:rPr>
+          <w:b w:val="0"/>
+          <w:sz w:val="20"/>
+        </w:rPr>
+      </w:r>
+    </w:p>
+    <w:p>
+      <w:r>
+        <w:rPr>
+          <w:b w:val="0"/>
+          <w:sz w:val="20"/>
+        </w:rPr>
+        <w:t>解说：好词好句墙分外形、动作、声音、性格四类，三十多个词语有例句。课堂可实时添加。底部有课本好句轮播——从《白鹭》《猫》《搭船的鸟》《燕子》《母鸡》《白鹅》《珍珠鸟》《跑进家来的松鼠》中精选八句，标注课文和年级，配有用法提示。</w:t>
+      </w:r>
+    </w:p>
+    <w:p>
+      <w:r>
+        <w:rPr>
+          <w:b w:val="0"/>
+          <w:sz w:val="24"/>
+        </w:rPr>
+      </w:r>
+    </w:p>
+    <w:p>
+      <w:r>
+        <w:rPr>
+          <w:b/>
+          <w:sz w:val="22"/>
+        </w:rPr>
+        <w:t>── 第5页 写作分析建议（1分钟） ──</w:t>
+      </w:r>
+    </w:p>
+    <w:p>
+      <w:r>
+        <w:rPr>
+          <w:b w:val="0"/>
+          <w:sz w:val="20"/>
+        </w:rPr>
+        <w:t>画面：PPT第5页 → 切入录屏</w:t>
+      </w:r>
+    </w:p>
+    <w:p>
+      <w:r>
+        <w:rPr>
+          <w:b w:val="0"/>
+          <w:sz w:val="20"/>
+        </w:rPr>
+        <w:t>内容：自查清单 + AI分析卡片 + 教师批注</w:t>
+      </w:r>
+    </w:p>
+    <w:p>
+      <w:r>
+        <w:rPr>
+          <w:b w:val="0"/>
+          <w:sz w:val="20"/>
+        </w:rPr>
+      </w:r>
+    </w:p>
+    <w:p>
+      <w:r>
+        <w:rPr>
+          <w:b w:val="0"/>
+          <w:sz w:val="20"/>
+        </w:rPr>
+        <w:t>解说：写前有自查清单。贴入作文，AI分析结果以卡片展示。底部有教师批注框。AI仅供教师参考。</w:t>
+      </w:r>
+    </w:p>
+    <w:p>
+      <w:r>
+        <w:rPr>
+          <w:b w:val="0"/>
+          <w:sz w:val="24"/>
+        </w:rPr>
+      </w:r>
+    </w:p>
+    <w:p>
+      <w:r>
+        <w:rPr>
+          <w:b/>
+          <w:sz w:val="22"/>
+        </w:rPr>
+        <w:t>── 第6页 问答+范文（含惠州特色）（1分30秒） ──</w:t>
+      </w:r>
+    </w:p>
+    <w:p>
+      <w:r>
+        <w:rPr>
+          <w:b w:val="0"/>
+          <w:sz w:val="20"/>
+        </w:rPr>
+        <w:t>画面：PPT第6页 → 切入录屏</w:t>
+      </w:r>
+    </w:p>
+    <w:p>
+      <w:r>
+        <w:rPr>
+          <w:b w:val="0"/>
+          <w:sz w:val="20"/>
+        </w:rPr>
+        <w:t>内容：多轮问答 + 7篇分年级范文 + 惠州地方特色</w:t>
+      </w:r>
+    </w:p>
+    <w:p>
+      <w:r>
+        <w:rPr>
+          <w:b w:val="0"/>
+          <w:sz w:val="20"/>
+        </w:rPr>
+      </w:r>
+    </w:p>
+    <w:p>
+      <w:r>
+        <w:rPr>
+          <w:b w:val="0"/>
+          <w:sz w:val="20"/>
+        </w:rPr>
+        <w:t>解说：问答支持连续追问。范文现七篇：三年级两篇（小金鱼、小白兔各350字）、四年级三篇（小狗乐乐、大公鸡各450字，惠州西湖白鹭430字）、五年级一篇（小猫雪球530字）。其中惠州西湖白鹭和罗浮山松鼠融入惠州元素，引用课文名句。</w:t>
+      </w:r>
+    </w:p>
+    <w:p>
+      <w:r>
+        <w:rPr>
+          <w:b w:val="0"/>
+          <w:sz w:val="24"/>
+        </w:rPr>
+      </w:r>
+    </w:p>
+    <w:p>
+      <w:r>
+        <w:rPr>
+          <w:b/>
+          <w:sz w:val="22"/>
+        </w:rPr>
+        <w:t>── 第7页 应用场景与效果（1分钟） ──</w:t>
+      </w:r>
+    </w:p>
+    <w:p>
+      <w:r>
+        <w:rPr>
+          <w:b w:val="0"/>
+          <w:sz w:val="20"/>
+        </w:rPr>
+        <w:t>画面：PPT第7页</w:t>
+      </w:r>
+    </w:p>
+    <w:p>
+      <w:r>
+        <w:rPr>
+          <w:b w:val="0"/>
+          <w:sz w:val="20"/>
+        </w:rPr>
+        <w:t>内容：课堂指导 → 课后分析 → 自主练习 + 四组数据</w:t>
+      </w:r>
+    </w:p>
+    <w:p>
+      <w:r>
+        <w:rPr>
+          <w:b w:val="0"/>
+          <w:sz w:val="20"/>
+        </w:rPr>
+      </w:r>
+    </w:p>
+    <w:p>
+      <w:r>
+        <w:rPr>
+          <w:b w:val="0"/>
+          <w:sz w:val="20"/>
+        </w:rPr>
+        <w:t>解说：四月中旬在四年级四个班试用，180名学生。课堂教学用闯关模式，课后用分析建议，课后服务用问答。三周效果：字数提升32%，主动写作从15%到40%，批改时间减少60%。</w:t>
+      </w:r>
+    </w:p>
+    <w:p>
+      <w:r>
+        <w:rPr>
+          <w:b w:val="0"/>
+          <w:sz w:val="24"/>
+        </w:rPr>
+      </w:r>
+    </w:p>
+    <w:p>
+      <w:r>
+        <w:rPr>
+          <w:b/>
+          <w:sz w:val="22"/>
+        </w:rPr>
+        <w:t>── 第8页 创新与合规（30秒） ──</w:t>
+      </w:r>
+    </w:p>
+    <w:p>
+      <w:r>
+        <w:rPr>
+          <w:b w:val="0"/>
+          <w:sz w:val="20"/>
+        </w:rPr>
+        <w:t>画面：PPT第8页</w:t>
+      </w:r>
+    </w:p>
+    <w:p>
+      <w:r>
+        <w:rPr>
+          <w:b w:val="0"/>
+          <w:sz w:val="20"/>
+        </w:rPr>
+        <w:t>内容：一生一导 + 精准聚焦 + 政策合规 + 成本极低 + MIT开源</w:t>
+      </w:r>
+    </w:p>
+    <w:p>
+      <w:r>
+        <w:rPr>
+          <w:b w:val="0"/>
+          <w:sz w:val="20"/>
+        </w:rPr>
+      </w:r>
+    </w:p>
+    <w:p>
+      <w:r>
+        <w:rPr>
+          <w:b w:val="0"/>
+          <w:sz w:val="20"/>
+        </w:rPr>
+        <w:t>解说：创新点：一生一导的个性化教学、精准聚焦动物习作、政策合规先行、基于开源Flask成本极低、MIT开源可复现。</w:t>
+      </w:r>
+    </w:p>
+    <w:p>
+      <w:r>
+        <w:rPr>
+          <w:b w:val="0"/>
+          <w:sz w:val="24"/>
+        </w:rPr>
+      </w:r>
+    </w:p>
+    <w:p>
+      <w:r>
+        <w:rPr>
+          <w:b/>
+          <w:sz w:val="22"/>
+        </w:rPr>
+        <w:t>── 第9页 致谢（5秒） ──</w:t>
+      </w:r>
+    </w:p>
+    <w:p>
+      <w:r>
+        <w:rPr>
+          <w:b w:val="0"/>
+          <w:sz w:val="20"/>
+        </w:rPr>
+        <w:t>画面：PPT第9页</w:t>
+      </w:r>
+    </w:p>
+    <w:p>
+      <w:r>
+        <w:rPr>
+          <w:b w:val="0"/>
+          <w:sz w:val="20"/>
+        </w:rPr>
+        <w:t>字幕：谢谢！ | GitHub: github.com/707978439-cpu/animal-writing-assistant</w:t>
+      </w:r>
+    </w:p>
+    <w:p>
+      <w:r>
+        <w:rPr>
+          <w:b w:val="0"/>
+          <w:sz w:val="20"/>
+        </w:rPr>
+      </w:r>
+    </w:p>
+    <w:p>
+      <w:r>
+        <w:rPr>
+          <w:b w:val="0"/>
+          <w:sz w:val="20"/>
+        </w:rPr>
+        <w:t>解说：以上就是我的案例汇报，欢迎大家使用交流，谢谢！</w:t>
       </w:r>
     </w:p>
     <w:sectPr>
-      <w:pgSz w:w="12240" w:h="15840"/>
-      <w:pgMar w:top="1440" w:right="1440" w:bottom="1440" w:left="1440" w:header="720" w:footer="720" w:gutter="0"/>
+      <w:pgSz w:w="11906" w:h="16838"/>
+      <w:pgMar w:top="1134" w:right="1134" w:bottom="1134" w:left="1134" w:header="720" w:footer="720" w:gutter="0"/>
       <w:cols w:space="720"/>
       <w:docGrid w:linePitch="360"/>
     </w:sectPr>

</xml_diff>

<commit_message>
Add Coze deployment info to report and narration
</commit_message>
<xml_diff>
--- a/PPT配套解说词.docx
+++ b/PPT配套解说词.docx
@@ -25,7 +25,7 @@
           <w:b w:val="0"/>
           <w:sz w:val="20"/>
         </w:rPr>
-        <w:t>总时长：≤8分钟 | 方式：PPT翻页+录屏穿插+语音解说</w:t>
+        <w:t>总时长：&lt;=8分钟 | 方式：PPT翻页+录屏穿插+语音解说 | 扣子在线版：zkdr6r7v98.coze.site</w:t>
       </w:r>
     </w:p>
     <w:p>
@@ -50,7 +50,7 @@
           <w:b/>
           <w:sz w:val="22"/>
         </w:rPr>
-        <w:t>── 第1页 封面（15秒） ──</w:t>
+        <w:t>-- 第1页 封面（15秒） --</w:t>
       </w:r>
     </w:p>
     <w:p>
@@ -85,7 +85,7 @@
           <w:b w:val="0"/>
           <w:sz w:val="20"/>
         </w:rPr>
-        <w:t>解说：大家好，我是惠州市富民小学语文教师许志超。今天我带来的案例是《动物习作AI智能助教》，一款专为小学语文教师设计的AI辅助教学工具。</w:t>
+        <w:t>解说：大家好，我是惠州市富民小学语文教师许志超。今天我带来《动物习作AI智能助教》，一款基于DeepSeek V4 Pro大模型的小学语文教学辅助工具。</w:t>
       </w:r>
     </w:p>
     <w:p>
@@ -102,7 +102,7 @@
           <w:b/>
           <w:sz w:val="22"/>
         </w:rPr>
-        <w:t>── 第2页 案例概述（1分30秒） ──</w:t>
+        <w:t>-- 第2页 案例概述（1分30秒） --</w:t>
       </w:r>
     </w:p>
     <w:p>
@@ -120,7 +120,7 @@
           <w:b w:val="0"/>
           <w:sz w:val="20"/>
         </w:rPr>
-        <w:t>内容：痛点（个性化不足、反馈慢、资源少）→ 方案（DeepSeek V4 Pro + Flask）→ 五大功能模块 → 四组数据 → 政策合规 + MIT开源 → GitHub</w:t>
+        <w:t>内容：痛点 -&gt; DeepSeek V4 Pro + Flask -&gt; 五大模块 -&gt; 扣子在线部署 -&gt; 四组数据</w:t>
       </w:r>
     </w:p>
     <w:p>
@@ -137,7 +137,7 @@
           <w:b w:val="0"/>
           <w:sz w:val="20"/>
         </w:rPr>
-        <w:t>解说：先说我做这个工具的起因。四年级动物习作，48个学生无法逐一指导；批改48篇作文要四到六小时。我用DeepSeek V4 Pro旗舰模型，通过Flask开发了本地工具。五个模块：写作闯关、好词好句墙、写作分析建议、互动问答、范文展示。试用数据：字数提升32%，主动写作从15%到40%，批改时间减少60%。本工具遵循《使用指南》，MIT开源，代码在GitHub上公开。</w:t>
+        <w:t>解说：做这个工具的起因是48个学生逐一指导难、批改周期长。我用DeepSeek V4 Pro通过Flask开发了本地工具，并部署到国产AI平台扣子上方便大家直接访问。五个模块：写作闯关、好词好句墙、写作分析建议、互动问答、范文展示。数据：字数提升32%，主动写作从15%到40%，批改时间减60%。</w:t>
       </w:r>
     </w:p>
     <w:p>
@@ -154,7 +154,7 @@
           <w:b/>
           <w:sz w:val="22"/>
         </w:rPr>
-        <w:t>── 第3页 写作闯关（1分钟） ──</w:t>
+        <w:t>-- 第3页 写作闯关（1分钟） --</w:t>
       </w:r>
     </w:p>
     <w:p>
@@ -163,7 +163,7 @@
           <w:b w:val="0"/>
           <w:sz w:val="20"/>
         </w:rPr>
-        <w:t>画面：PPT第3页 → 切入录屏</w:t>
+        <w:t>画面：PPT第3页 + 录屏</w:t>
       </w:r>
     </w:p>
     <w:p>
@@ -172,7 +172,7 @@
           <w:b w:val="0"/>
           <w:sz w:val="20"/>
         </w:rPr>
-        <w:t>内容：五步引导 + 进度条 + 推荐词语 + 鼓励弹窗</w:t>
+        <w:t>内容：五步引导 + 进度条 + 推荐词语</w:t>
       </w:r>
     </w:p>
     <w:p>
@@ -189,7 +189,7 @@
           <w:b w:val="0"/>
           <w:sz w:val="20"/>
         </w:rPr>
-        <w:t>解说：写作闯关把写作分成五步。输入动物名，点下一步。每步有引导问题、小窍门、推荐词语。点击词语可加入好词墙。完成有鼓励弹窗。</w:t>
+        <w:t>解说：写作闯关分五步：选动物到外形到习性到故事到完成。每步有引导问题、小窍门、推荐词语。</w:t>
       </w:r>
     </w:p>
     <w:p>
@@ -206,7 +206,7 @@
           <w:b/>
           <w:sz w:val="22"/>
         </w:rPr>
-        <w:t>── 第4页 好词好句墙+课本好句（1分钟） ──</w:t>
+        <w:t>-- 第4页 好词好句墙+课本好句（1分钟） --</w:t>
       </w:r>
     </w:p>
     <w:p>
@@ -215,7 +215,7 @@
           <w:b w:val="0"/>
           <w:sz w:val="20"/>
         </w:rPr>
-        <w:t>画面：PPT第4页 → 切入录屏</w:t>
+        <w:t>画面：PPT第4页 + 录屏</w:t>
       </w:r>
     </w:p>
     <w:p>
@@ -224,7 +224,7 @@
           <w:b w:val="0"/>
           <w:sz w:val="20"/>
         </w:rPr>
-        <w:t>内容：四大分类好词库 + 课堂添加 + 课本好句轮播</w:t>
+        <w:t>内容：四大分类 + 课堂添加 + 课本好句轮播</w:t>
       </w:r>
     </w:p>
     <w:p>
@@ -241,7 +241,7 @@
           <w:b w:val="0"/>
           <w:sz w:val="20"/>
         </w:rPr>
-        <w:t>解说：好词好句墙分外形、动作、声音、性格四类，三十多个词语有例句。课堂可实时添加。底部有课本好句轮播——从《白鹭》《猫》《搭船的鸟》《燕子》《母鸡》《白鹅》《珍珠鸟》《跑进家来的松鼠》中精选八句，标注课文和年级，配有用法提示。</w:t>
+        <w:t>解说：好词墙分四类，三十多词配例句。课堂可实时添加。底部课本好句轮播覆盖八篇课文。</w:t>
       </w:r>
     </w:p>
     <w:p>
@@ -258,7 +258,7 @@
           <w:b/>
           <w:sz w:val="22"/>
         </w:rPr>
-        <w:t>── 第5页 写作分析建议（1分钟） ──</w:t>
+        <w:t>-- 第5页 写作分析建议（1分钟） --</w:t>
       </w:r>
     </w:p>
     <w:p>
@@ -267,7 +267,7 @@
           <w:b w:val="0"/>
           <w:sz w:val="20"/>
         </w:rPr>
-        <w:t>画面：PPT第5页 → 切入录屏</w:t>
+        <w:t>画面：PPT第5页 + 录屏</w:t>
       </w:r>
     </w:p>
     <w:p>
@@ -293,7 +293,7 @@
           <w:b w:val="0"/>
           <w:sz w:val="20"/>
         </w:rPr>
-        <w:t>解说：写前有自查清单。贴入作文，AI分析结果以卡片展示。底部有教师批注框。AI仅供教师参考。</w:t>
+        <w:t>解说：写前自查八项，AI分析卡片展示，教师可补充批注。AI仅供教师参考。</w:t>
       </w:r>
     </w:p>
     <w:p>
@@ -310,7 +310,7 @@
           <w:b/>
           <w:sz w:val="22"/>
         </w:rPr>
-        <w:t>── 第6页 问答+范文（含惠州特色）（1分30秒） ──</w:t>
+        <w:t>-- 第6页 问答+范文（1分30秒） --</w:t>
       </w:r>
     </w:p>
     <w:p>
@@ -319,7 +319,7 @@
           <w:b w:val="0"/>
           <w:sz w:val="20"/>
         </w:rPr>
-        <w:t>画面：PPT第6页 → 切入录屏</w:t>
+        <w:t>画面：PPT第6页 + 录屏</w:t>
       </w:r>
     </w:p>
     <w:p>
@@ -328,7 +328,7 @@
           <w:b w:val="0"/>
           <w:sz w:val="20"/>
         </w:rPr>
-        <w:t>内容：多轮问答 + 7篇分年级范文 + 惠州地方特色</w:t>
+        <w:t>内容：多轮问答 + 七篇分年级范文（含惠州特色）</w:t>
       </w:r>
     </w:p>
     <w:p>
@@ -345,7 +345,7 @@
           <w:b w:val="0"/>
           <w:sz w:val="20"/>
         </w:rPr>
-        <w:t>解说：问答支持连续追问。范文现七篇：三年级两篇（小金鱼、小白兔各350字）、四年级三篇（小狗乐乐、大公鸡各450字，惠州西湖白鹭430字）、五年级一篇（小猫雪球530字）。其中惠州西湖白鹭和罗浮山松鼠融入惠州元素，引用课文名句。</w:t>
+        <w:t>解说：问答支持连续追问。范文七篇含惠州西湖白鹭、罗浮山松鼠。</w:t>
       </w:r>
     </w:p>
     <w:p>
@@ -362,7 +362,7 @@
           <w:b/>
           <w:sz w:val="22"/>
         </w:rPr>
-        <w:t>── 第7页 应用场景与效果（1分钟） ──</w:t>
+        <w:t>-- 第7页 应用场景与效果（1分钟） --</w:t>
       </w:r>
     </w:p>
     <w:p>
@@ -380,7 +380,7 @@
           <w:b w:val="0"/>
           <w:sz w:val="20"/>
         </w:rPr>
-        <w:t>内容：课堂指导 → 课后分析 → 自主练习 + 四组数据</w:t>
+        <w:t>内容：课堂 -&gt; 课后 -&gt; 自主练习 + 四组数据</w:t>
       </w:r>
     </w:p>
     <w:p>
@@ -397,7 +397,7 @@
           <w:b w:val="0"/>
           <w:sz w:val="20"/>
         </w:rPr>
-        <w:t>解说：四月中旬在四年级四个班试用，180名学生。课堂教学用闯关模式，课后用分析建议，课后服务用问答。三周效果：字数提升32%，主动写作从15%到40%，批改时间减少60%。</w:t>
+        <w:t>解说：四月中在四个班试用，180名学生。字数提升32%，主动写作从15%到40%，批改时间减60%。</w:t>
       </w:r>
     </w:p>
     <w:p>
@@ -414,7 +414,7 @@
           <w:b/>
           <w:sz w:val="22"/>
         </w:rPr>
-        <w:t>── 第8页 创新与合规（30秒） ──</w:t>
+        <w:t>-- 第8页 创新与合规（30秒） --</w:t>
       </w:r>
     </w:p>
     <w:p>
@@ -432,7 +432,7 @@
           <w:b w:val="0"/>
           <w:sz w:val="20"/>
         </w:rPr>
-        <w:t>内容：一生一导 + 精准聚焦 + 政策合规 + 成本极低 + MIT开源</w:t>
+        <w:t>内容：一生一导 + 精准聚焦 + 政策合规 + 扣子部署</w:t>
       </w:r>
     </w:p>
     <w:p>
@@ -449,7 +449,7 @@
           <w:b w:val="0"/>
           <w:sz w:val="20"/>
         </w:rPr>
-        <w:t>解说：创新点：一生一导的个性化教学、精准聚焦动物习作、政策合规先行、基于开源Flask成本极低、MIT开源可复现。</w:t>
+        <w:t>解说：个性教学、聚焦痛点、政策先行、成本极低、扣子部署方便师生家长。</w:t>
       </w:r>
     </w:p>
     <w:p>
@@ -466,7 +466,7 @@
           <w:b/>
           <w:sz w:val="22"/>
         </w:rPr>
-        <w:t>── 第9页 致谢（5秒） ──</w:t>
+        <w:t>-- 第9页 致谢（5秒） --</w:t>
       </w:r>
     </w:p>
     <w:p>
@@ -484,7 +484,7 @@
           <w:b w:val="0"/>
           <w:sz w:val="20"/>
         </w:rPr>
-        <w:t>字幕：谢谢！ | GitHub: github.com/707978439-cpu/animal-writing-assistant</w:t>
+        <w:t>字幕：谢谢！GitHub + 扣子在线版</w:t>
       </w:r>
     </w:p>
     <w:p>
@@ -501,7 +501,7 @@
           <w:b w:val="0"/>
           <w:sz w:val="20"/>
         </w:rPr>
-        <w:t>解说：以上就是我的案例汇报，欢迎大家使用交流，谢谢！</w:t>
+        <w:t>解说：以上就是我的案例汇报，谢谢大家！</w:t>
       </w:r>
     </w:p>
     <w:sectPr>

</xml_diff>